<commit_message>
Format Data availability per BMC's required software-archive template
BMC Medical Informatics and Decision Making prescribes a specific structured format for the Availability of data and materials section (project name/home page/archived version/OS/language/requirements/license/restrictions), documented in their submission guidelines. Updated manuscript.md and regenerated the docx and rendered manuscript accordingly. Fixed the docx generator to keep these label:value fields on separate lines rather than merging them into one run-on paragraph.
</commit_message>
<xml_diff>
--- a/manuscript/Senapati_Manuscript_BMC_Medical_Informatics_and_Decision_Making.docx
+++ b/manuscript/Senapati_Manuscript_BMC_Medical_Informatics_and_Decision_Making.docx
@@ -9676,7 +9676,133 @@
           <w:i w:val="0"/>
           <w:sz w:val="24"/>
         </w:rPr>
-        <w:t>No dataset containing human, patient, or identifiable personal data was generated, accessed, or analysed. The synthetic episode set is not a dataset of observations but is produced deterministically by the episode generator, and is therefore distributed as code rather than as data; the generator, the frozen episode manifest with its SHA-256 digest, and all episode-level run outputs (one JSONL record per condition-episode run, including the full action trace, gateway dispositions, adjudication verdicts, and provenance) are archived in the versioned deposit at https://doi.org/10.5281/zenodo.22851264. The GitHub repository (https://github.com/lipsasenapati/risk-calibrated-autonomy-healthcare-agents) is a development mirror and is not the citable archive.</w:t>
+        <w:t>No dataset containing human, patient, or identifiable personal data was generated, accessed, or analysed. The synthetic episode set is not a dataset of observations but is produced deterministically by the episode generator, and is therefore distributed as code rather than as data. The dataset(s) supporting the conclusions of this article — the frozen episode manifest with its SHA-256 digest, and all episode-level run outputs (one JSONL record per condition-episode run, including the full action trace, gateway dispositions, adjudication verdicts, and provenance) — are available in the Zenodo repository, https://doi.org/10.5281/zenodo.22851264.</w:t>
+      </w:r>
+    </w:p>
+    <w:p>
+      <w:pPr>
+        <w:spacing w:before="0" w:after="120" w:line="360" w:lineRule="exact"/>
+      </w:pPr>
+      <w:r>
+        <w:rPr>
+          <w:rFonts w:ascii="Times New Roman" w:hAnsi="Times New Roman"/>
+          <w:b w:val="0"/>
+          <w:i w:val="0"/>
+          <w:sz w:val="24"/>
+        </w:rPr>
+        <w:t>Project name: Risk-Calibrated Autonomy for Healthcare AI Agents</w:t>
+      </w:r>
+    </w:p>
+    <w:p>
+      <w:pPr>
+        <w:spacing w:before="0" w:after="120" w:line="360" w:lineRule="exact"/>
+      </w:pPr>
+      <w:r>
+        <w:rPr>
+          <w:rFonts w:ascii="Times New Roman" w:hAnsi="Times New Roman"/>
+          <w:b w:val="0"/>
+          <w:i w:val="0"/>
+          <w:sz w:val="24"/>
+        </w:rPr>
+        <w:t>Project home page: https://github.com/lipsasenapati/risk-calibrated-autonomy-healthcare-agents</w:t>
+      </w:r>
+    </w:p>
+    <w:p>
+      <w:pPr>
+        <w:spacing w:before="0" w:after="120" w:line="360" w:lineRule="exact"/>
+      </w:pPr>
+      <w:r>
+        <w:rPr>
+          <w:rFonts w:ascii="Times New Roman" w:hAnsi="Times New Roman"/>
+          <w:b w:val="0"/>
+          <w:i w:val="0"/>
+          <w:sz w:val="24"/>
+        </w:rPr>
+        <w:t>Archived version: https://doi.org/10.5281/zenodo.22851264 (commit 5e49069)</w:t>
+      </w:r>
+    </w:p>
+    <w:p>
+      <w:pPr>
+        <w:spacing w:before="0" w:after="120" w:line="360" w:lineRule="exact"/>
+      </w:pPr>
+      <w:r>
+        <w:rPr>
+          <w:rFonts w:ascii="Times New Roman" w:hAnsi="Times New Roman"/>
+          <w:b w:val="0"/>
+          <w:i w:val="0"/>
+          <w:sz w:val="24"/>
+        </w:rPr>
+        <w:t>Operating system(s): Platform independent</w:t>
+      </w:r>
+    </w:p>
+    <w:p>
+      <w:pPr>
+        <w:spacing w:before="0" w:after="120" w:line="360" w:lineRule="exact"/>
+      </w:pPr>
+      <w:r>
+        <w:rPr>
+          <w:rFonts w:ascii="Times New Roman" w:hAnsi="Times New Roman"/>
+          <w:b w:val="0"/>
+          <w:i w:val="0"/>
+          <w:sz w:val="24"/>
+        </w:rPr>
+        <w:t>Programming language: Python</w:t>
+      </w:r>
+    </w:p>
+    <w:p>
+      <w:pPr>
+        <w:spacing w:before="0" w:after="120" w:line="360" w:lineRule="exact"/>
+      </w:pPr>
+      <w:r>
+        <w:rPr>
+          <w:rFonts w:ascii="Times New Roman" w:hAnsi="Times New Roman"/>
+          <w:b w:val="0"/>
+          <w:i w:val="0"/>
+          <w:sz w:val="24"/>
+        </w:rPr>
+        <w:t>Other requirements: Python 3.8 or higher; an OpenAI API key for the prespecified model is required to reproduce the live-agent run, supplied through the environment (no credential is contained in the repository)</w:t>
+      </w:r>
+    </w:p>
+    <w:p>
+      <w:pPr>
+        <w:spacing w:before="0" w:after="120" w:line="360" w:lineRule="exact"/>
+      </w:pPr>
+      <w:r>
+        <w:rPr>
+          <w:rFonts w:ascii="Times New Roman" w:hAnsi="Times New Roman"/>
+          <w:b w:val="0"/>
+          <w:i w:val="0"/>
+          <w:sz w:val="24"/>
+        </w:rPr>
+        <w:t>License: MIT</w:t>
+      </w:r>
+    </w:p>
+    <w:p>
+      <w:pPr>
+        <w:spacing w:before="0" w:after="120" w:line="360" w:lineRule="exact"/>
+      </w:pPr>
+      <w:r>
+        <w:rPr>
+          <w:rFonts w:ascii="Times New Roman" w:hAnsi="Times New Roman"/>
+          <w:b w:val="0"/>
+          <w:i w:val="0"/>
+          <w:sz w:val="24"/>
+        </w:rPr>
+        <w:t>Any restrictions to use by non-academics: None</w:t>
+      </w:r>
+    </w:p>
+    <w:p>
+      <w:pPr>
+        <w:spacing w:before="0" w:after="120" w:line="360" w:lineRule="exact"/>
+      </w:pPr>
+      <w:r>
+        <w:rPr>
+          <w:rFonts w:ascii="Times New Roman" w:hAnsi="Times New Roman"/>
+          <w:b w:val="0"/>
+          <w:i w:val="0"/>
+          <w:sz w:val="24"/>
+        </w:rPr>
+        <w:t>The GitHub repository above is a development mirror and is not the citable archive. The preregistration is at https://osf.io/3wc9s.</w:t>
       </w:r>
     </w:p>
     <w:p>
@@ -9703,7 +9829,7 @@
           <w:i w:val="0"/>
           <w:sz w:val="24"/>
         </w:rPr>
-        <w:t>All code required to reproduce the benchmark and the reported analysis — episode generator, tool environment, Action Safety Gateway, Dynamic Autonomy Controller, agent adapters, adjudicator, analysis scripts, figure generation, and the test suite — is archived under the MIT licence at https://doi.org/10.5281/zenodo.22851264, corresponding to commit 5e49069. The preregistration is at https://osf.io/3wc9s. Reproducing the reported tables and figures requires an API key for the prespecified model, supplied through the environment; no credential is contained in the repository.</w:t>
+        <w:t>All code required to reproduce the benchmark and the reported analysis — episode generator, tool environment, Action Safety Gateway, Dynamic Autonomy Controller, agent adapters, adjudicator, analysis scripts, figure generation, and the test suite — is archived under the MIT licence at the same Zenodo deposit as above (https://doi.org/10.5281/zenodo.22851264), corresponding to commit 5e49069.</w:t>
       </w:r>
     </w:p>
     <w:p>

</xml_diff>